<commit_message>
feat: Purge unlearned frameworks & Target SGPA, align 30-day curriculum with Django, Python, SQL, and authentic project defense
</commit_message>
<xml_diff>
--- a/exports/resumes/Sarthak_Backend_Resume.docx
+++ b/exports/resumes/Sarthak_Backend_Resume.docx
@@ -29,7 +29,7 @@
           <w:color w:val="1E3A8A"/>
           <w:sz w:val="17"/>
         </w:rPr>
-        <w:t>Python Backend Developer · Systems Architect · CTO @ DevQBX</w:t>
+        <w:t>Python Backend Developer | Django &amp; FastAPI | SQL &amp; Linux</w:t>
       </w:r>
     </w:p>
     <w:p>
@@ -77,7 +77,7 @@
           <w:color w:val="334155"/>
           <w:sz w:val="17"/>
         </w:rPr>
-        <w:t>3rd-year BCA student at VSICS Kanpur (CSJMU) with proven experience architecting high-concurrency asynchronous backend services, event-driven pipelines, and relational database schemas. Hands-on proficiency in Python (AsyncIO, FastAPI, aiohttp), PostgreSQL, SQLite WAL concurrency, and Linux VPS hardening.</w:t>
+        <w:t>3rd-year BCA student at VSICS Kanpur (CSJMU) with strong hands-on experience in Python backend development, RESTful API engineering, and relational database design. Built and scaled real-world applications including BulkBeat TV (₹1.11L revenue, 6K+ users) and College Student Management System (CSMS). Proficient in Python (Django, FastAPI), SQL (PostgreSQL, SQLite), HTML/CSS/JavaScript, and Linux server deployment.</w:t>
       </w:r>
     </w:p>
     <w:p>
@@ -117,7 +117,7 @@
           <w:color w:val="334155"/>
           <w:sz w:val="16"/>
         </w:rPr>
-        <w:t>Python (AsyncIO, Pydantic, SQLAlchemy), SQL, TypeScript, JavaScript, C, Java</w:t>
+        <w:t>Python, SQL, JavaScript (ES6+), HTML5, CSS3, C, Java</w:t>
       </w:r>
     </w:p>
     <w:p>
@@ -131,7 +131,7 @@
           <w:color w:val="0F172A"/>
           <w:sz w:val="16"/>
         </w:rPr>
-        <w:t xml:space="preserve">Frameworks &amp; APIs: </w:t>
+        <w:t xml:space="preserve">Backend &amp; APIs: </w:t>
       </w:r>
       <w:r>
         <w:rPr>
@@ -139,7 +139,7 @@
           <w:color w:val="334155"/>
           <w:sz w:val="16"/>
         </w:rPr>
-        <w:t>FastAPI, aiohttp, REST APIs, WebSockets, Next.js 16, Uvicorn, OpenAPI/Swagger</w:t>
+        <w:t>Python, Django, FastAPI, RESTful APIs, Uvicorn, Requests, Webhooks, Postman</w:t>
       </w:r>
     </w:p>
     <w:p>
@@ -153,7 +153,7 @@
           <w:color w:val="0F172A"/>
           <w:sz w:val="16"/>
         </w:rPr>
-        <w:t xml:space="preserve">Databases &amp; Cloud: </w:t>
+        <w:t xml:space="preserve">Databases: </w:t>
       </w:r>
       <w:r>
         <w:rPr>
@@ -161,7 +161,7 @@
           <w:color w:val="334155"/>
           <w:sz w:val="16"/>
         </w:rPr>
-        <w:t>PostgreSQL, SQLite (WAL mode, busy-timeout queues), Supabase, Redis, Linux VPS Hardening</w:t>
+        <w:t>PostgreSQL, SQLite (WAL mode), Database Schema Design, Normalization, ACID Transactions</w:t>
       </w:r>
     </w:p>
     <w:p>
@@ -175,7 +175,7 @@
           <w:color w:val="0F172A"/>
           <w:sz w:val="16"/>
         </w:rPr>
-        <w:t xml:space="preserve">Systems &amp; Tools: </w:t>
+        <w:t xml:space="preserve">DevOps &amp; Tools: </w:t>
       </w:r>
       <w:r>
         <w:rPr>
@@ -183,7 +183,29 @@
           <w:color w:val="334155"/>
           <w:sz w:val="16"/>
         </w:rPr>
-        <w:t>Docker, Git/GitHub, Systemd, APScheduler, Tesseract OCR, PyMuPDF, Render, Nginx</w:t>
+        <w:t>Linux (Ubuntu, Bash, systemd), Git, GitHub, Docker (basics), Render, Nginx</w:t>
+      </w:r>
+    </w:p>
+    <w:p>
+      <w:pPr>
+        <w:spacing w:before="0" w:after="20"/>
+      </w:pPr>
+      <w:r>
+        <w:rPr>
+          <w:rFonts w:ascii="Arial" w:hAnsi="Arial"/>
+          <w:b/>
+          <w:color w:val="0F172A"/>
+          <w:sz w:val="16"/>
+        </w:rPr>
+        <w:t xml:space="preserve">CS Fundamentals: </w:t>
+      </w:r>
+      <w:r>
+        <w:rPr>
+          <w:rFonts w:ascii="Arial" w:hAnsi="Arial"/>
+          <w:color w:val="334155"/>
+          <w:sz w:val="16"/>
+        </w:rPr>
+        <w:t>Data Structures &amp; Algorithms (50+ solved patterns), Object-Oriented Programming (OOP), DBMS, Operating Systems, Computer Networks</w:t>
       </w:r>
     </w:p>
     <w:p>
@@ -216,7 +238,7 @@
           <w:color w:val="0F172A"/>
           <w:sz w:val="17"/>
         </w:rPr>
-        <w:t>Chief Technology Officer (CTO)</w:t>
+        <w:t>Technical Lead &amp; Web Coordinator</w:t>
       </w:r>
       <w:r>
         <w:rPr>
@@ -247,7 +269,7 @@
           <w:color w:val="1F2937"/>
           <w:sz w:val="16"/>
         </w:rPr>
-        <w:t>Directing system architecture for 500+ builder community — engineering standards, hackathon platform (QBX Arena), and API integrations.</w:t>
+        <w:t>Led web development and technical operations for a 500+ student developer community, coordinating project showcases and hackathons.</w:t>
       </w:r>
     </w:p>
     <w:p>
@@ -261,7 +283,7 @@
           <w:color w:val="1F2937"/>
           <w:sz w:val="16"/>
         </w:rPr>
-        <w:t>Mentoring developers on async backend patterns, API contract design, and production deployment reliability.</w:t>
+        <w:t>Mentored junior students on Python backend fundamentals, relational database design with SQL, and Git collaboration workflows.</w:t>
       </w:r>
     </w:p>
     <w:p>
@@ -276,7 +298,7 @@
           <w:color w:val="0F172A"/>
           <w:sz w:val="17"/>
         </w:rPr>
-        <w:t>Project Manager &amp; Systems Architect</w:t>
+        <w:t>Backend Developer</w:t>
       </w:r>
       <w:r>
         <w:rPr>
@@ -307,7 +329,7 @@
           <w:color w:val="1F2937"/>
           <w:sz w:val="16"/>
         </w:rPr>
-        <w:t>Architected BulkBeat TV Telegram engine; engineered 22-rule AI scoring and &lt;5s alert latency on 1GB VPS for paying subscribers.</w:t>
+        <w:t>Developed the backend architecture for BulkBeat TV, engineering automated financial news ingestion and Telegram alert broadcasting.</w:t>
       </w:r>
     </w:p>
     <w:p>
@@ -321,7 +343,7 @@
           <w:color w:val="1F2937"/>
           <w:sz w:val="16"/>
         </w:rPr>
-        <w:t>Implemented SQLite WAL concurrency (30s busy-timeout), automated billing pipelines, and hardened Linux VPS deployments.</w:t>
+        <w:t>Configured SQLite with WAL mode for concurrent operations and deployed production services on an Ubuntu Linux VPS with systemd monitoring.</w:t>
       </w:r>
     </w:p>
     <w:p>
@@ -362,7 +384,7 @@
           <w:color w:val="475569"/>
           <w:sz w:val="16"/>
         </w:rPr>
-        <w:t xml:space="preserve"> — Systems Architect &amp; Backend Lead</w:t>
+        <w:t xml:space="preserve"> — Backend Developer &amp; Project Lead</w:t>
       </w:r>
     </w:p>
     <w:p>
@@ -376,7 +398,7 @@
           <w:color w:val="1F2937"/>
           <w:sz w:val="16"/>
         </w:rPr>
-        <w:t>Engineered an event-driven ingestion engine in Python AsyncIO, scanning 5+ live exchange/media feeds with sub-5s Telegram Webhook alert delivery.</w:t>
+        <w:t>Engineered a Python-based real-time market news and alert system, scanning 5+ live exchange and financial news feeds with automated parsing.</w:t>
       </w:r>
     </w:p>
     <w:p>
@@ -390,7 +412,7 @@
           <w:color w:val="1F2937"/>
           <w:sz w:val="16"/>
         </w:rPr>
-        <w:t>Implemented 22-rule deterministic AI scoring eliminating 90%+ market noise; built cookie warming and identity rotation routines to bypass bot blocks.</w:t>
+        <w:t>Implemented a deterministic 20+ keyword filtering engine to eliminate market noise and highlight high-impact corporate announcements.</w:t>
       </w:r>
     </w:p>
     <w:p>
@@ -404,7 +426,21 @@
           <w:color w:val="1F2937"/>
           <w:sz w:val="16"/>
         </w:rPr>
-        <w:t>Optimized SQLite with Write-Ahead Logging (WAL) and 30s busy-timeout queues; scaled to 6,000+ active users and ₹1.11L revenue within months.</w:t>
+        <w:t>Integrated automated Telegram Bot alerts for instant subscriber notifications; managed user subscriptions and payment tracking with SQLite database.</w:t>
+      </w:r>
+    </w:p>
+    <w:p>
+      <w:pPr>
+        <w:pStyle w:val="ListBullet"/>
+        <w:spacing w:before="0" w:after="20"/>
+      </w:pPr>
+      <w:r>
+        <w:rPr>
+          <w:rFonts w:ascii="Arial" w:hAnsi="Arial"/>
+          <w:color w:val="1F2937"/>
+          <w:sz w:val="16"/>
+        </w:rPr>
+        <w:t>Scaled platform to 6,000+ active users and generated ₹1.11 Lakhs in subscription revenue within months, running 24/7 on an Ubuntu Linux VPS.</w:t>
       </w:r>
     </w:p>
     <w:p>
@@ -419,7 +455,7 @@
           <w:color w:val="0F172A"/>
           <w:sz w:val="17"/>
         </w:rPr>
-        <w:t>SmartGalla — Geospatial Hyperlocal Commerce Platform</w:t>
+        <w:t>College Student Management System (CSMS) — Educational ERP Portal</w:t>
       </w:r>
       <w:r>
         <w:rPr>
@@ -427,7 +463,7 @@
           <w:color w:val="475569"/>
           <w:sz w:val="16"/>
         </w:rPr>
-        <w:t xml:space="preserve"> — Backend &amp; Database Engineer</w:t>
+        <w:t xml:space="preserve"> — Backend Developer · BCA 5th Sem Capstone Project</w:t>
       </w:r>
     </w:p>
     <w:p>
@@ -441,7 +477,7 @@
           <w:color w:val="1F2937"/>
           <w:sz w:val="16"/>
         </w:rPr>
-        <w:t>Engineered Point-in-Polygon geofencing with in-memory LRU cache, delivering sub-100ms merchant spatial queries and atomic PostgreSQL ledgers.</w:t>
+        <w:t>Developed an educational ERP web portal using Python (FastAPI), PostgreSQL, and a responsive HTML5/CSS3/JavaScript frontend.</w:t>
       </w:r>
     </w:p>
     <w:p>
@@ -455,7 +491,7 @@
           <w:color w:val="1F2937"/>
           <w:sz w:val="16"/>
         </w:rPr>
-        <w:t>Designed multi-tenant schema with 50+ migrations, Row-Level Security (RLS) policies, and atomic credit/cash-on-delivery payment ledgers.</w:t>
+        <w:t>Implemented Role-Based Access Control (RBAC) across 4 user roles: HOD, Section Incharge, Faculty, and Students with bcrypt password hashing.</w:t>
       </w:r>
     </w:p>
     <w:p>
@@ -469,7 +505,21 @@
           <w:color w:val="1F2937"/>
           <w:sz w:val="16"/>
         </w:rPr>
-        <w:t>Piloted across 4–5 local Kirana shops in Kanpur; validated spatial delta replication before sunsetting due to hosting infrastructure costs.</w:t>
+        <w:t>Designed normalized PostgreSQL schema for daily class attendance tracking, automated &lt;75% attendance shortage alerts, and student grade calculation.</w:t>
+      </w:r>
+    </w:p>
+    <w:p>
+      <w:pPr>
+        <w:pStyle w:val="ListBullet"/>
+        <w:spacing w:before="0" w:after="20"/>
+      </w:pPr>
+      <w:r>
+        <w:rPr>
+          <w:rFonts w:ascii="Arial" w:hAnsi="Arial"/>
+          <w:color w:val="1F2937"/>
+          <w:sz w:val="16"/>
+        </w:rPr>
+        <w:t>Built semester fee ledger managing Paid, Partial, and Pending payment records; deployed application on Render cloud platform.</w:t>
       </w:r>
     </w:p>
     <w:p>
@@ -484,7 +534,7 @@
           <w:color w:val="0F172A"/>
           <w:sz w:val="17"/>
         </w:rPr>
-        <w:t>College Student Management System (CSMS) — Cloud Educational ERP</w:t>
+        <w:t>SmartGalla — Hyperlocal Kirana Store &amp; Order Management</w:t>
       </w:r>
       <w:r>
         <w:rPr>
@@ -492,7 +542,7 @@
           <w:color w:val="475569"/>
           <w:sz w:val="16"/>
         </w:rPr>
-        <w:t xml:space="preserve"> — Backend Engineer</w:t>
+        <w:t xml:space="preserve"> — Backend &amp; Database Developer</w:t>
       </w:r>
     </w:p>
     <w:p>
@@ -506,7 +556,7 @@
           <w:color w:val="1F2937"/>
           <w:sz w:val="16"/>
         </w:rPr>
-        <w:t>Developed cloud-native Educational ERP REST API in FastAPI (Python) and PostgreSQL featuring 28 endpoints with automated OpenAPI docs.</w:t>
+        <w:t>Developed a hyperlocal store management and ordering web portal for local Kirana merchants using Python, HTML5, CSS3, JavaScript, and PostgreSQL.</w:t>
       </w:r>
     </w:p>
     <w:p>
@@ -520,7 +570,7 @@
           <w:color w:val="1F2937"/>
           <w:sz w:val="16"/>
         </w:rPr>
-        <w:t>Architected 4-tier Role-Based Access Control (HOD, Section Incharge, Faculty, Student) using JWT authentication and bcrypt password hashing.</w:t>
+        <w:t>Built product catalog management, real-time inventory tracking, and customer order placement workflows with Cash on Delivery (COD) tracking.</w:t>
       </w:r>
     </w:p>
     <w:p>
@@ -534,7 +584,7 @@
           <w:color w:val="1F2937"/>
           <w:sz w:val="16"/>
         </w:rPr>
-        <w:t>Enforced composite relational constraints (student_id, record_date) for attendance logging (&lt;75% warning trigger) and automated grade evaluation.</w:t>
+        <w:t>Successfully piloted across 4–5 local Kirana grocery stores in Kanpur to validate real-world ordering before sunsetting due to hosting infrastructure costs.</w:t>
       </w:r>
     </w:p>
     <w:p>
@@ -549,7 +599,7 @@
           <w:color w:val="0F172A"/>
           <w:sz w:val="17"/>
         </w:rPr>
-        <w:t>DocRoute — Adaptive Document Intelligence Engine</w:t>
+        <w:t>DocRoute — Document Text Extraction Engine</w:t>
       </w:r>
       <w:r>
         <w:rPr>
@@ -557,7 +607,7 @@
           <w:color w:val="475569"/>
           <w:sz w:val="16"/>
         </w:rPr>
-        <w:t xml:space="preserve"> — Systems Engineer · Status: Under Development</w:t>
+        <w:t xml:space="preserve"> — Python Developer · Status: Under Development</w:t>
       </w:r>
     </w:p>
     <w:p>
@@ -571,7 +621,7 @@
           <w:color w:val="1F2937"/>
           <w:sz w:val="16"/>
         </w:rPr>
-        <w:t>Architecting modular document extraction engine combining PyMuPDF native vector text parsing with an OCR fallback pipeline for scanned pages.</w:t>
+        <w:t>Developing a modular Python utility for extracting text from PDF documents and image files with automated fallback handling.</w:t>
       </w:r>
     </w:p>
     <w:p>
@@ -585,7 +635,7 @@
           <w:color w:val="1F2937"/>
           <w:sz w:val="16"/>
         </w:rPr>
-        <w:t>Designing quality-assessment routing heuristic that inspects character density and rendering resolution before invoking OCR workers.</w:t>
+        <w:t>Utilizes PyMuPDF for high-speed digital text extraction, automatically routing scanned or image-based pages to Tesseract OCR.</w:t>
       </w:r>
     </w:p>
     <w:p>
@@ -599,7 +649,7 @@
           <w:color w:val="1F2937"/>
           <w:sz w:val="16"/>
         </w:rPr>
-        <w:t>Structuring unified JSON schema with extraction provenance for downstream NLP pipelines (benchmarks reserved until full evaluation).</w:t>
+        <w:t>Generates clean structured JSON output containing extracted text, page numbers, and document metadata for downstream analysis.</w:t>
       </w:r>
     </w:p>
     <w:p>
@@ -647,7 +697,7 @@
           <w:color w:val="64748B"/>
           <w:sz w:val="16"/>
         </w:rPr>
-        <w:t xml:space="preserve">    (2024 – 2027 | CGPA: 8.0 / 10 · Target SGPA: &gt;= 9.0)</w:t>
+        <w:t xml:space="preserve">    (2024 – 2027 | CGPA: 8.0 / 10)</w:t>
       </w:r>
     </w:p>
     <w:p>
@@ -678,7 +728,7 @@
           <w:color w:val="334155"/>
           <w:sz w:val="16"/>
         </w:rPr>
-        <w:t>Generative AI &amp; Data Analytics — Simplilearn (Distinction)   •   ML Internship — CodSoft (Distinction)   •   Azure Cloud — VSICS   •   National Hackathon Finalist — ECLearnix (Distinction)</w:t>
+        <w:t>Generative AI &amp; Data Analytics — Simplilearn (Distinction)   •   Machine Learning Internship — CodSoft (Distinction)   •   Cloud Computing Basics — VSICS   •   National Hackathon Finalist — ECLearnix</w:t>
       </w:r>
     </w:p>
     <w:sectPr>

</xml_diff>

<commit_message>
feat: Remove DevQBX, retain Sitekraft in experience, and add full certifications across all resumes
</commit_message>
<xml_diff>
--- a/exports/resumes/Sarthak_Backend_Resume.docx
+++ b/exports/resumes/Sarthak_Backend_Resume.docx
@@ -224,66 +224,6 @@
           <w:sz w:val="19"/>
         </w:rPr>
         <w:t>WORK EXPERIENCE</w:t>
-      </w:r>
-    </w:p>
-    <w:p>
-      <w:pPr>
-        <w:keepNext/>
-        <w:spacing w:before="40" w:after="0"/>
-      </w:pPr>
-      <w:r>
-        <w:rPr>
-          <w:rFonts w:ascii="Arial" w:hAnsi="Arial"/>
-          <w:b/>
-          <w:color w:val="0F172A"/>
-          <w:sz w:val="17"/>
-        </w:rPr>
-        <w:t>Technical Lead &amp; Web Coordinator</w:t>
-      </w:r>
-      <w:r>
-        <w:rPr>
-          <w:rFonts w:ascii="Arial" w:hAnsi="Arial"/>
-          <w:b/>
-          <w:color w:val="1E3A8A"/>
-          <w:sz w:val="16"/>
-        </w:rPr>
-        <w:t xml:space="preserve"> · DevQBX · devqbx.in</w:t>
-      </w:r>
-      <w:r>
-        <w:rPr>
-          <w:rFonts w:ascii="Arial" w:hAnsi="Arial"/>
-          <w:color w:val="64748B"/>
-          <w:sz w:val="15"/>
-        </w:rPr>
-        <w:t xml:space="preserve">    (07/2026 – Present | Kanpur / Remote)</w:t>
-      </w:r>
-    </w:p>
-    <w:p>
-      <w:pPr>
-        <w:pStyle w:val="ListBullet"/>
-        <w:spacing w:before="0" w:after="20"/>
-      </w:pPr>
-      <w:r>
-        <w:rPr>
-          <w:rFonts w:ascii="Arial" w:hAnsi="Arial"/>
-          <w:color w:val="1F2937"/>
-          <w:sz w:val="16"/>
-        </w:rPr>
-        <w:t>Led web development and technical operations for a 500+ student developer community, coordinating project showcases and hackathons.</w:t>
-      </w:r>
-    </w:p>
-    <w:p>
-      <w:pPr>
-        <w:pStyle w:val="ListBullet"/>
-        <w:spacing w:before="0" w:after="20"/>
-      </w:pPr>
-      <w:r>
-        <w:rPr>
-          <w:rFonts w:ascii="Arial" w:hAnsi="Arial"/>
-          <w:color w:val="1F2937"/>
-          <w:sz w:val="16"/>
-        </w:rPr>
-        <w:t>Mentored junior students on Python backend fundamentals, relational database design with SQL, and Git collaboration workflows.</w:t>
       </w:r>
     </w:p>
     <w:p>
@@ -718,19 +658,205 @@
         <w:t>CERTIFICATIONS &amp; HONORS</w:t>
       </w:r>
     </w:p>
-    <w:p>
-      <w:pPr>
-        <w:spacing w:before="20" w:after="0"/>
-      </w:pPr>
-      <w:r>
-        <w:rPr>
-          <w:rFonts w:ascii="Arial" w:hAnsi="Arial"/>
-          <w:color w:val="334155"/>
-          <w:sz w:val="16"/>
-        </w:rPr>
-        <w:t>Generative AI &amp; Data Analytics — Simplilearn (Distinction)   •   Machine Learning Internship — CodSoft (Distinction)   •   Cloud Computing Basics — VSICS   •   National Hackathon Finalist — ECLearnix</w:t>
-      </w:r>
-    </w:p>
+    <w:tbl>
+      <w:tblPr>
+        <w:tblW w:type="auto" w:w="0"/>
+        <w:jc w:val="left"/>
+        <w:tblLayout w:type="fixed"/>
+        <w:tblLook w:firstColumn="1" w:firstRow="1" w:lastColumn="0" w:lastRow="0" w:noHBand="0" w:noVBand="1" w:val="04A0"/>
+      </w:tblPr>
+      <w:tblGrid>
+        <w:gridCol w:w="5306"/>
+        <w:gridCol w:w="5306"/>
+      </w:tblGrid>
+      <w:tr>
+        <w:tc>
+          <w:tcPr>
+            <w:tcW w:type="dxa" w:w="5299"/>
+            <w:tcMar>
+              <w:top w:w="10" w:type="dxa"/>
+              <w:bottom w:w="10" w:type="dxa"/>
+              <w:left w:w="0" w:type="dxa"/>
+              <w:right w:w="10" w:type="dxa"/>
+            </w:tcMar>
+          </w:tcPr>
+          <w:p>
+            <w:pPr>
+              <w:spacing w:before="0" w:after="20"/>
+            </w:pPr>
+            <w:r>
+              <w:rPr>
+                <w:rFonts w:ascii="Arial" w:hAnsi="Arial"/>
+                <w:b/>
+                <w:color w:val="0F172A"/>
+                <w:sz w:val="16"/>
+              </w:rPr>
+              <w:t xml:space="preserve">• </w:t>
+            </w:r>
+            <w:r>
+              <w:rPr>
+                <w:rFonts w:ascii="Arial" w:hAnsi="Arial"/>
+                <w:color w:val="334155"/>
+                <w:sz w:val="16"/>
+              </w:rPr>
+              <w:t>Generative AI &amp; Data Analytics — Simplilearn (Distinction)</w:t>
+            </w:r>
+          </w:p>
+        </w:tc>
+        <w:tc>
+          <w:tcPr>
+            <w:tcW w:type="dxa" w:w="5299"/>
+            <w:tcMar>
+              <w:top w:w="10" w:type="dxa"/>
+              <w:bottom w:w="10" w:type="dxa"/>
+              <w:left w:w="0" w:type="dxa"/>
+              <w:right w:w="10" w:type="dxa"/>
+            </w:tcMar>
+          </w:tcPr>
+          <w:p>
+            <w:pPr>
+              <w:spacing w:before="0" w:after="20"/>
+            </w:pPr>
+            <w:r>
+              <w:rPr>
+                <w:rFonts w:ascii="Arial" w:hAnsi="Arial"/>
+                <w:b/>
+                <w:color w:val="0F172A"/>
+                <w:sz w:val="16"/>
+              </w:rPr>
+              <w:t xml:space="preserve">• </w:t>
+            </w:r>
+            <w:r>
+              <w:rPr>
+                <w:rFonts w:ascii="Arial" w:hAnsi="Arial"/>
+                <w:color w:val="334155"/>
+                <w:sz w:val="16"/>
+              </w:rPr>
+              <w:t>National Hackathon Finalist — ECLearnix (Top Finalist)</w:t>
+            </w:r>
+          </w:p>
+        </w:tc>
+      </w:tr>
+      <w:tr>
+        <w:tc>
+          <w:tcPr>
+            <w:tcW w:type="dxa" w:w="5299"/>
+            <w:tcMar>
+              <w:top w:w="10" w:type="dxa"/>
+              <w:bottom w:w="10" w:type="dxa"/>
+              <w:left w:w="0" w:type="dxa"/>
+              <w:right w:w="10" w:type="dxa"/>
+            </w:tcMar>
+          </w:tcPr>
+          <w:p>
+            <w:pPr>
+              <w:spacing w:before="0" w:after="20"/>
+            </w:pPr>
+            <w:r>
+              <w:rPr>
+                <w:rFonts w:ascii="Arial" w:hAnsi="Arial"/>
+                <w:b/>
+                <w:color w:val="0F172A"/>
+                <w:sz w:val="16"/>
+              </w:rPr>
+              <w:t xml:space="preserve">• </w:t>
+            </w:r>
+            <w:r>
+              <w:rPr>
+                <w:rFonts w:ascii="Arial" w:hAnsi="Arial"/>
+                <w:color w:val="334155"/>
+                <w:sz w:val="16"/>
+              </w:rPr>
+              <w:t>Machine Learning Internship Certification — CodSoft (Distinction)</w:t>
+            </w:r>
+          </w:p>
+        </w:tc>
+        <w:tc>
+          <w:tcPr>
+            <w:tcW w:type="dxa" w:w="5299"/>
+            <w:tcMar>
+              <w:top w:w="10" w:type="dxa"/>
+              <w:bottom w:w="10" w:type="dxa"/>
+              <w:left w:w="0" w:type="dxa"/>
+              <w:right w:w="10" w:type="dxa"/>
+            </w:tcMar>
+          </w:tcPr>
+          <w:p>
+            <w:pPr>
+              <w:spacing w:before="0" w:after="20"/>
+            </w:pPr>
+            <w:r>
+              <w:rPr>
+                <w:rFonts w:ascii="Arial" w:hAnsi="Arial"/>
+                <w:b/>
+                <w:color w:val="0F172A"/>
+                <w:sz w:val="16"/>
+              </w:rPr>
+              <w:t xml:space="preserve">• </w:t>
+            </w:r>
+            <w:r>
+              <w:rPr>
+                <w:rFonts w:ascii="Arial" w:hAnsi="Arial"/>
+                <w:color w:val="334155"/>
+                <w:sz w:val="16"/>
+              </w:rPr>
+              <w:t>Full-Stack Web Development Systems — VSICS</w:t>
+            </w:r>
+          </w:p>
+        </w:tc>
+      </w:tr>
+      <w:tr>
+        <w:tc>
+          <w:tcPr>
+            <w:tcW w:type="dxa" w:w="5299"/>
+            <w:tcMar>
+              <w:top w:w="10" w:type="dxa"/>
+              <w:bottom w:w="10" w:type="dxa"/>
+              <w:left w:w="0" w:type="dxa"/>
+              <w:right w:w="10" w:type="dxa"/>
+            </w:tcMar>
+          </w:tcPr>
+          <w:p>
+            <w:pPr>
+              <w:spacing w:before="0" w:after="20"/>
+            </w:pPr>
+            <w:r>
+              <w:rPr>
+                <w:rFonts w:ascii="Arial" w:hAnsi="Arial"/>
+                <w:b/>
+                <w:color w:val="0F172A"/>
+                <w:sz w:val="16"/>
+              </w:rPr>
+              <w:t xml:space="preserve">• </w:t>
+            </w:r>
+            <w:r>
+              <w:rPr>
+                <w:rFonts w:ascii="Arial" w:hAnsi="Arial"/>
+                <w:color w:val="334155"/>
+                <w:sz w:val="16"/>
+              </w:rPr>
+              <w:t>Cloud Computing &amp; Azure Fundamentals — VSICS</w:t>
+            </w:r>
+          </w:p>
+        </w:tc>
+        <w:tc>
+          <w:tcPr>
+            <w:tcW w:type="dxa" w:w="5299"/>
+            <w:tcMar>
+              <w:top w:w="10" w:type="dxa"/>
+              <w:bottom w:w="10" w:type="dxa"/>
+              <w:left w:w="0" w:type="dxa"/>
+              <w:right w:w="10" w:type="dxa"/>
+            </w:tcMar>
+          </w:tcPr>
+          <w:p>
+            <w:pPr>
+              <w:spacing w:before="0" w:after="20"/>
+            </w:pPr>
+          </w:p>
+        </w:tc>
+      </w:tr>
+    </w:tbl>
     <w:sectPr>
       <w:pgSz w:w="11909" w:h="16834"/>
       <w:pgMar w:top="576" w:right="648" w:bottom="576" w:left="648" w:header="720" w:footer="720" w:gutter="0"/>

</xml_diff>